<commit_message>
Update Word report for simplified structure and remove extra formats
</commit_message>
<xml_diff>
--- a/report/Assignment4_HomeTheater_Report.docx
+++ b/report/Assignment4_HomeTheater_Report.docx
@@ -44,7 +44,7 @@
     </w:p>
     <w:p>
       <w:r>
-        <w:t>I implemented five subsystem classes: Amplifier, DvdPlayer, Projector, Screen and RoomLights. They store real state and check whether an operation is allowed. HomeTheaterFacade coordinates these classes through two public methods: watchMovie(String title) and endMovie(). Main is the client and only works with the facade. The project is a state-based simulation, not a controller for physical hardware.</w:t>
+        <w:t>I implemented five subsystem classes: Amplifier, DvdPlayer, Projector, Screen and RoomLights. They store state and check whether an operation is allowed. HomeTheaterFacade coordinates them through two public methods: watchMovie(String title) and endMovie(). Main is the client and only works with the facade. To keep the folder structure simple, all the Java files are in the hometheater package (src/main/java/hometheater), with tests in src/test/java/hometheater. This is a state-based simulation, not a controller for physical hardware.</w:t>
       </w:r>
     </w:p>
     <w:p>
@@ -104,7 +104,7 @@
     </w:p>
     <w:p>
       <w:r>
-        <w:t>The diagram shows the main dependency direction: Main knows only HomeTheaterFacade. The facade has references to the five subsystems and decides in what order to call them. There are no references from subsystem classes back to the facade. That is important because an advanced client can still use the devices directly when it needs more control.</w:t>
+        <w:t>The diagram shows the dependency direction: Main knows only HomeTheaterFacade. The facade has references to the five subsystems and decides in what order to call them. There are no references from subsystem classes back to the facade. Even though these classes are now in one short Java package, an advanced client can still use the devices directly when it needs more control.</w:t>
       </w:r>
     </w:p>
     <w:p>
@@ -706,7 +706,7 @@
     </w:p>
     <w:p>
       <w:r>
-        <w:t>The project includes source code, nine tests, a README with run instructions, this UML diagram and incremental Git commits. The GitHub address needs to be added after the repository is pushed.</w:t>
+        <w:t>The project has a simple structure: source code in src/main/java/hometheater, nine tests in src/test/java/hometheater, a README with run instructions, this UML diagram and incremental Git commits. The GitHub address needs to be added after the repository is pushed.</w:t>
       </w:r>
     </w:p>
     <w:sectPr>

</xml_diff>